<commit_message>
Uso de la IA en la ciberdefensa (area Defend): 35 9.3, SEG-21 a SEG-25 y RT-SEG-08 (D116, entrega 5 del encargo del 25-09-2026)
- Documento 35 (ES/EN): seccion 9.3, la ciberdefensa con IA como caso de uso: autonomia por tipo de accion de contencion, validacion humana, calidad de la deteccion frente a linea base, dependencia del proveedor y pruebas adversarias del sistema defensivo; controles SEG-21 a SEG-25 con su funcion CSF e indicador para el consejo.
- Documento 33: riesgo tipo RT-SEG-08 (71 riesgos tipo) y su entrada en catalogo_riesgos.json; registro T01 regenerado.
- 34 5.3 y P72: Defend deja de figurar sin cobertura; glosario 02 al dia; verificar_coherencia.ps1 (23) exige 25 controles SEG.
</commit_message>
<xml_diff>
--- a/SEVEN-G/docx/en/plantillas/P72_SEVEN-G_Perfil_de_seguridad_de_IA_CSF_y_Cyber_AI_Profile.docx
+++ b/SEVEN-G/docx/en/plantillas/P72_SEVEN-G_Perfil_de_seguridad_de_IA_CSF_y_Cyber_AI_Profile.docx
@@ -8048,7 +8048,7 @@
               <w:pStyle w:val="Celda"/>
             </w:pPr>
             <w:r>
-              <w:t xml:space="preserve">No specific coverage in version 0.x (34 §5.3): assessed as a use case with the autonomy levels of 35 §5.</w:t>
+              <w:t xml:space="preserve">35 §9.3; SEG-21 to SEG-25 and autonomy levels A0–A3</w:t>
             </w:r>
           </w:p>
         </w:tc>
@@ -9485,6 +9485,47 @@
             </w:r>
             <w:r>
               <w:t xml:space="preserve"> as a view and the summaries by CSF function and by Secure, Defend and Thwart area.</w:t>
+            </w:r>
+          </w:p>
+        </w:tc>
+      </w:tr>
+      <w:tr>
+        <w:tc>
+          <w:tcPr>
+            <w:tcW w:w="3213" w:type="dxa"/>
+          </w:tcPr>
+          <w:p>
+            <w:pPr>
+              <w:pStyle w:val="Celda"/>
+            </w:pPr>
+            <w:r>
+              <w:t xml:space="preserve">0.2</w:t>
+            </w:r>
+          </w:p>
+        </w:tc>
+        <w:tc>
+          <w:tcPr>
+            <w:tcW w:w="3213" w:type="dxa"/>
+          </w:tcPr>
+          <w:p>
+            <w:pPr>
+              <w:pStyle w:val="Celda"/>
+            </w:pPr>
+            <w:r>
+              <w:t xml:space="preserve">25-09-2026</w:t>
+            </w:r>
+          </w:p>
+        </w:tc>
+        <w:tc>
+          <w:tcPr>
+            <w:tcW w:w="3213" w:type="dxa"/>
+          </w:tcPr>
+          <w:p>
+            <w:pPr>
+              <w:pStyle w:val="Celda"/>
+            </w:pPr>
+            <w:r>
+              <w:t xml:space="preserve">The Defend area refers to 35 §9.3 and controls SEG-21 to SEG-25.</w:t>
             </w:r>
           </w:p>
         </w:tc>

</xml_diff>